<commit_message>
Put LifeGroup and Verse by Verse on the same Sunday, 27 September.
Co-authored-by: Cursor <cursoragent@cursor.com>
</commit_message>
<xml_diff>
--- a/scripts/Announcement-Script-2026-09-20.docx
+++ b/scripts/Announcement-Script-2026-09-20.docx
@@ -217,7 +217,7 @@
           <w:color w:val="C00000"/>
           <w:sz w:val="22"/>
         </w:rPr>
-        <w:t>Sunday, September 26th, 2026</w:t>
+        <w:t>Sunday, September 27th, 2026</w:t>
       </w:r>
       <w:r>
         <w:rPr>
@@ -280,7 +280,7 @@
           <w:color w:val="000000"/>
           <w:sz w:val="22"/>
         </w:rPr>
-        <w:t xml:space="preserve"> is </w:t>
+        <w:t xml:space="preserve"> is that same Sunday, </w:t>
       </w:r>
       <w:r>
         <w:rPr>
@@ -289,7 +289,7 @@
           <w:color w:val="C00000"/>
           <w:sz w:val="22"/>
         </w:rPr>
-        <w:t>Sunday, September 27th at 8:15 AM</w:t>
+        <w:t>first service at 8:15 AM</w:t>
       </w:r>
       <w:r>
         <w:rPr>
@@ -298,7 +298,7 @@
           <w:color w:val="000000"/>
           <w:sz w:val="22"/>
         </w:rPr>
-        <w:t xml:space="preserve"> — first service. Come ready to sit with Scripture, slowly and together.</w:t>
+        <w:t>. Come ready to sit with Scripture, slowly and together.</w:t>
       </w:r>
     </w:p>
     <w:p>

</xml_diff>